<commit_message>
Adding Statistics notes about graphes
</commit_message>
<xml_diff>
--- a/Statistics-And-Statistical-Analysis/Statistics-Notes-02.docx
+++ b/Statistics-And-Statistical-Analysis/Statistics-Notes-02.docx
@@ -95,6 +95,631 @@
         <w:t>=====================================================</w:t>
       </w:r>
     </w:p>
+    <w:p>
+      <w:r>
+        <w:rPr>
+          <w:noProof/>
+        </w:rPr>
+        <w:lastRenderedPageBreak/>
+        <w:drawing>
+          <wp:inline distT="0" distB="0" distL="0" distR="0" wp14:anchorId="6203DC23" wp14:editId="6F6B4D50">
+            <wp:extent cx="4533900" cy="3193106"/>
+            <wp:effectExtent l="0" t="0" r="0" b="7620"/>
+            <wp:docPr id="2033604092" name="Picture 1"/>
+            <wp:cNvGraphicFramePr>
+              <a:graphicFrameLocks xmlns:a="http://schemas.openxmlformats.org/drawingml/2006/main" noChangeAspect="1"/>
+            </wp:cNvGraphicFramePr>
+            <a:graphic xmlns:a="http://schemas.openxmlformats.org/drawingml/2006/main">
+              <a:graphicData uri="http://schemas.openxmlformats.org/drawingml/2006/picture">
+                <pic:pic xmlns:pic="http://schemas.openxmlformats.org/drawingml/2006/picture">
+                  <pic:nvPicPr>
+                    <pic:cNvPr id="2033604092" name=""/>
+                    <pic:cNvPicPr/>
+                  </pic:nvPicPr>
+                  <pic:blipFill>
+                    <a:blip r:embed="rId6"/>
+                    <a:stretch>
+                      <a:fillRect/>
+                    </a:stretch>
+                  </pic:blipFill>
+                  <pic:spPr>
+                    <a:xfrm>
+                      <a:off x="0" y="0"/>
+                      <a:ext cx="4538211" cy="3196142"/>
+                    </a:xfrm>
+                    <a:prstGeom prst="rect">
+                      <a:avLst/>
+                    </a:prstGeom>
+                  </pic:spPr>
+                </pic:pic>
+              </a:graphicData>
+            </a:graphic>
+          </wp:inline>
+        </w:drawing>
+      </w:r>
+    </w:p>
+    <w:p>
+      <w:pPr>
+        <w:ind w:left="720" w:firstLine="720"/>
+      </w:pPr>
+      <w:r>
+        <w:t>=====================================================</w:t>
+      </w:r>
+    </w:p>
+    <w:p>
+      <w:r>
+        <w:rPr>
+          <w:noProof/>
+        </w:rPr>
+        <w:lastRenderedPageBreak/>
+        <w:drawing>
+          <wp:anchor distT="0" distB="0" distL="114300" distR="114300" simplePos="0" relativeHeight="251658240" behindDoc="0" locked="0" layoutInCell="1" allowOverlap="1" wp14:anchorId="452F98A1" wp14:editId="0562D3C4">
+            <wp:simplePos x="0" y="0"/>
+            <wp:positionH relativeFrom="margin">
+              <wp:align>left</wp:align>
+            </wp:positionH>
+            <wp:positionV relativeFrom="paragraph">
+              <wp:posOffset>0</wp:posOffset>
+            </wp:positionV>
+            <wp:extent cx="2907665" cy="5076825"/>
+            <wp:effectExtent l="0" t="0" r="6985" b="9525"/>
+            <wp:wrapSquare wrapText="bothSides"/>
+            <wp:docPr id="191599952" name="Picture 1"/>
+            <wp:cNvGraphicFramePr>
+              <a:graphicFrameLocks xmlns:a="http://schemas.openxmlformats.org/drawingml/2006/main" noChangeAspect="1"/>
+            </wp:cNvGraphicFramePr>
+            <a:graphic xmlns:a="http://schemas.openxmlformats.org/drawingml/2006/main">
+              <a:graphicData uri="http://schemas.openxmlformats.org/drawingml/2006/picture">
+                <pic:pic xmlns:pic="http://schemas.openxmlformats.org/drawingml/2006/picture">
+                  <pic:nvPicPr>
+                    <pic:cNvPr id="191599952" name=""/>
+                    <pic:cNvPicPr/>
+                  </pic:nvPicPr>
+                  <pic:blipFill>
+                    <a:blip r:embed="rId7">
+                      <a:extLst>
+                        <a:ext uri="{28A0092B-C50C-407E-A947-70E740481C1C}">
+                          <a14:useLocalDpi xmlns:a14="http://schemas.microsoft.com/office/drawing/2010/main" val="0"/>
+                        </a:ext>
+                      </a:extLst>
+                    </a:blip>
+                    <a:stretch>
+                      <a:fillRect/>
+                    </a:stretch>
+                  </pic:blipFill>
+                  <pic:spPr>
+                    <a:xfrm>
+                      <a:off x="0" y="0"/>
+                      <a:ext cx="2907665" cy="5076825"/>
+                    </a:xfrm>
+                    <a:prstGeom prst="rect">
+                      <a:avLst/>
+                    </a:prstGeom>
+                  </pic:spPr>
+                </pic:pic>
+              </a:graphicData>
+            </a:graphic>
+            <wp14:sizeRelH relativeFrom="margin">
+              <wp14:pctWidth>0</wp14:pctWidth>
+            </wp14:sizeRelH>
+            <wp14:sizeRelV relativeFrom="margin">
+              <wp14:pctHeight>0</wp14:pctHeight>
+            </wp14:sizeRelV>
+          </wp:anchor>
+        </w:drawing>
+      </w:r>
+      <w:r>
+        <w:rPr>
+          <w:noProof/>
+        </w:rPr>
+        <w:drawing>
+          <wp:inline distT="0" distB="0" distL="0" distR="0" wp14:anchorId="270C7E2D" wp14:editId="0C016D04">
+            <wp:extent cx="2714876" cy="5048250"/>
+            <wp:effectExtent l="0" t="0" r="9525" b="0"/>
+            <wp:docPr id="1013967747" name="Picture 1"/>
+            <wp:cNvGraphicFramePr>
+              <a:graphicFrameLocks xmlns:a="http://schemas.openxmlformats.org/drawingml/2006/main" noChangeAspect="1"/>
+            </wp:cNvGraphicFramePr>
+            <a:graphic xmlns:a="http://schemas.openxmlformats.org/drawingml/2006/main">
+              <a:graphicData uri="http://schemas.openxmlformats.org/drawingml/2006/picture">
+                <pic:pic xmlns:pic="http://schemas.openxmlformats.org/drawingml/2006/picture">
+                  <pic:nvPicPr>
+                    <pic:cNvPr id="1013967747" name=""/>
+                    <pic:cNvPicPr/>
+                  </pic:nvPicPr>
+                  <pic:blipFill>
+                    <a:blip r:embed="rId8"/>
+                    <a:stretch>
+                      <a:fillRect/>
+                    </a:stretch>
+                  </pic:blipFill>
+                  <pic:spPr>
+                    <a:xfrm>
+                      <a:off x="0" y="0"/>
+                      <a:ext cx="2718350" cy="5054710"/>
+                    </a:xfrm>
+                    <a:prstGeom prst="rect">
+                      <a:avLst/>
+                    </a:prstGeom>
+                  </pic:spPr>
+                </pic:pic>
+              </a:graphicData>
+            </a:graphic>
+          </wp:inline>
+        </w:drawing>
+      </w:r>
+    </w:p>
+    <w:p>
+      <w:pPr>
+        <w:ind w:left="720" w:firstLine="720"/>
+      </w:pPr>
+      <w:r>
+        <w:t>=====================================================</w:t>
+      </w:r>
+    </w:p>
+    <w:p>
+      <w:r>
+        <w:rPr>
+          <w:noProof/>
+        </w:rPr>
+        <w:drawing>
+          <wp:inline distT="0" distB="0" distL="0" distR="0" wp14:anchorId="0ACB83ED" wp14:editId="67AC2860">
+            <wp:extent cx="2543048" cy="2409825"/>
+            <wp:effectExtent l="0" t="0" r="0" b="0"/>
+            <wp:docPr id="1145291336" name="Picture 1"/>
+            <wp:cNvGraphicFramePr>
+              <a:graphicFrameLocks xmlns:a="http://schemas.openxmlformats.org/drawingml/2006/main" noChangeAspect="1"/>
+            </wp:cNvGraphicFramePr>
+            <a:graphic xmlns:a="http://schemas.openxmlformats.org/drawingml/2006/main">
+              <a:graphicData uri="http://schemas.openxmlformats.org/drawingml/2006/picture">
+                <pic:pic xmlns:pic="http://schemas.openxmlformats.org/drawingml/2006/picture">
+                  <pic:nvPicPr>
+                    <pic:cNvPr id="1145291336" name=""/>
+                    <pic:cNvPicPr/>
+                  </pic:nvPicPr>
+                  <pic:blipFill>
+                    <a:blip r:embed="rId9"/>
+                    <a:stretch>
+                      <a:fillRect/>
+                    </a:stretch>
+                  </pic:blipFill>
+                  <pic:spPr>
+                    <a:xfrm>
+                      <a:off x="0" y="0"/>
+                      <a:ext cx="2573534" cy="2438714"/>
+                    </a:xfrm>
+                    <a:prstGeom prst="rect">
+                      <a:avLst/>
+                    </a:prstGeom>
+                  </pic:spPr>
+                </pic:pic>
+              </a:graphicData>
+            </a:graphic>
+          </wp:inline>
+        </w:drawing>
+      </w:r>
+    </w:p>
+    <w:p>
+      <w:pPr>
+        <w:ind w:left="720" w:firstLine="720"/>
+      </w:pPr>
+      <w:r>
+        <w:t>=====================================================</w:t>
+      </w:r>
+    </w:p>
+    <w:p>
+      <w:r>
+        <w:rPr>
+          <w:noProof/>
+        </w:rPr>
+        <w:lastRenderedPageBreak/>
+        <w:drawing>
+          <wp:inline distT="0" distB="0" distL="0" distR="0" wp14:anchorId="33441995" wp14:editId="0E25727F">
+            <wp:extent cx="6419850" cy="6477000"/>
+            <wp:effectExtent l="0" t="0" r="0" b="0"/>
+            <wp:docPr id="325524919" name="Picture 1"/>
+            <wp:cNvGraphicFramePr>
+              <a:graphicFrameLocks xmlns:a="http://schemas.openxmlformats.org/drawingml/2006/main" noChangeAspect="1"/>
+            </wp:cNvGraphicFramePr>
+            <a:graphic xmlns:a="http://schemas.openxmlformats.org/drawingml/2006/main">
+              <a:graphicData uri="http://schemas.openxmlformats.org/drawingml/2006/picture">
+                <pic:pic xmlns:pic="http://schemas.openxmlformats.org/drawingml/2006/picture">
+                  <pic:nvPicPr>
+                    <pic:cNvPr id="325524919" name=""/>
+                    <pic:cNvPicPr/>
+                  </pic:nvPicPr>
+                  <pic:blipFill>
+                    <a:blip r:embed="rId10"/>
+                    <a:stretch>
+                      <a:fillRect/>
+                    </a:stretch>
+                  </pic:blipFill>
+                  <pic:spPr>
+                    <a:xfrm>
+                      <a:off x="0" y="0"/>
+                      <a:ext cx="6419850" cy="6477000"/>
+                    </a:xfrm>
+                    <a:prstGeom prst="rect">
+                      <a:avLst/>
+                    </a:prstGeom>
+                  </pic:spPr>
+                </pic:pic>
+              </a:graphicData>
+            </a:graphic>
+          </wp:inline>
+        </w:drawing>
+      </w:r>
+    </w:p>
+    <w:p>
+      <w:pPr>
+        <w:ind w:left="720" w:firstLine="720"/>
+      </w:pPr>
+      <w:r>
+        <w:t>=====================================================</w:t>
+      </w:r>
+    </w:p>
+    <w:p>
+      <w:pPr>
+        <w:rPr>
+          <w:rFonts w:ascii="Sakkal Majalla" w:hAnsi="Sakkal Majalla" w:cs="Sakkal Majalla"/>
+          <w:sz w:val="28"/>
+          <w:szCs w:val="28"/>
+        </w:rPr>
+      </w:pPr>
+    </w:p>
+    <w:p>
+      <w:pPr>
+        <w:rPr>
+          <w:rFonts w:ascii="Sakkal Majalla" w:hAnsi="Sakkal Majalla" w:cs="Sakkal Majalla"/>
+          <w:sz w:val="28"/>
+          <w:szCs w:val="28"/>
+        </w:rPr>
+      </w:pPr>
+    </w:p>
+    <w:p>
+      <w:pPr>
+        <w:rPr>
+          <w:rFonts w:ascii="Sakkal Majalla" w:hAnsi="Sakkal Majalla" w:cs="Sakkal Majalla"/>
+          <w:sz w:val="28"/>
+          <w:szCs w:val="28"/>
+        </w:rPr>
+      </w:pPr>
+    </w:p>
+    <w:p>
+      <w:pPr>
+        <w:rPr>
+          <w:rFonts w:ascii="Sakkal Majalla" w:hAnsi="Sakkal Majalla" w:cs="Sakkal Majalla"/>
+          <w:sz w:val="28"/>
+          <w:szCs w:val="28"/>
+        </w:rPr>
+      </w:pPr>
+      <w:r>
+        <w:rPr>
+          <w:rFonts w:ascii="Sakkal Majalla" w:hAnsi="Sakkal Majalla" w:cs="Sakkal Majalla"/>
+          <w:sz w:val="28"/>
+          <w:szCs w:val="28"/>
+        </w:rPr>
+        <w:lastRenderedPageBreak/>
+        <w:t xml:space="preserve">Line charts are good at showing trends in your data. For each set of data, you plot your points and then join them together with lines. You can easily show multiple sets of data on the same chart without it getting too cluttered. Just make sure </w:t>
+      </w:r>
+      <w:proofErr w:type="gramStart"/>
+      <w:r>
+        <w:rPr>
+          <w:rFonts w:ascii="Sakkal Majalla" w:hAnsi="Sakkal Majalla" w:cs="Sakkal Majalla"/>
+          <w:sz w:val="28"/>
+          <w:szCs w:val="28"/>
+        </w:rPr>
+        <w:t>it’s</w:t>
+      </w:r>
+      <w:proofErr w:type="gramEnd"/>
+      <w:r>
+        <w:rPr>
+          <w:rFonts w:ascii="Sakkal Majalla" w:hAnsi="Sakkal Majalla" w:cs="Sakkal Majalla"/>
+          <w:sz w:val="28"/>
+          <w:szCs w:val="28"/>
+        </w:rPr>
+        <w:t xml:space="preserve"> clear which line is which. </w:t>
+      </w:r>
+    </w:p>
+    <w:p>
+      <w:pPr>
+        <w:rPr>
+          <w:rFonts w:ascii="Sakkal Majalla" w:hAnsi="Sakkal Majalla" w:cs="Sakkal Majalla"/>
+          <w:sz w:val="28"/>
+          <w:szCs w:val="28"/>
+        </w:rPr>
+      </w:pPr>
+      <w:r>
+        <w:rPr>
+          <w:rFonts w:ascii="Sakkal Majalla" w:hAnsi="Sakkal Majalla" w:cs="Sakkal Majalla"/>
+          <w:sz w:val="28"/>
+          <w:szCs w:val="28"/>
+        </w:rPr>
+        <w:t xml:space="preserve">As with other sorts of charts, you have a choice of showing frequency or percentages on the vertical axis. The scale you use all depends on what key facts you want to draw out. </w:t>
+      </w:r>
+    </w:p>
+    <w:p>
+      <w:r>
+        <w:rPr>
+          <w:rFonts w:ascii="Sakkal Majalla" w:hAnsi="Sakkal Majalla" w:cs="Sakkal Majalla"/>
+          <w:sz w:val="28"/>
+          <w:szCs w:val="28"/>
+        </w:rPr>
+        <w:t xml:space="preserve">Line charts are often used to show time measurements. Time always goes on the horizontal axis, and frequency on the vertical. </w:t>
+      </w:r>
+      <w:r>
+        <w:rPr>
+          <w:rFonts w:ascii="Sakkal Majalla" w:hAnsi="Sakkal Majalla" w:cs="Sakkal Majalla"/>
+          <w:b/>
+          <w:bCs/>
+          <w:color w:val="538135" w:themeColor="accent6" w:themeShade="BF"/>
+          <w:sz w:val="28"/>
+          <w:szCs w:val="28"/>
+        </w:rPr>
+        <w:t>You can read off the frequency for any period of time by choosing the time value on the horizontal axis</w:t>
+      </w:r>
+      <w:r>
+        <w:rPr>
+          <w:rFonts w:ascii="Sakkal Majalla" w:hAnsi="Sakkal Majalla" w:cs="Sakkal Majalla"/>
+          <w:sz w:val="28"/>
+          <w:szCs w:val="28"/>
+        </w:rPr>
+        <w:t>, and reading off the corresponding frequency for that point on</w:t>
+      </w:r>
+      <w:r>
+        <w:t xml:space="preserve"> the line.</w:t>
+      </w:r>
+    </w:p>
+    <w:p>
+      <w:pPr>
+        <w:ind w:left="720" w:firstLine="720"/>
+      </w:pPr>
+      <w:r>
+        <w:t>=====================================================</w:t>
+      </w:r>
+    </w:p>
+    <w:p>
+      <w:r>
+        <w:t xml:space="preserve">On this arranged data, we may have a </w:t>
+      </w:r>
+      <w:proofErr w:type="gramStart"/>
+      <w:r>
+        <w:t>different values</w:t>
+      </w:r>
+      <w:proofErr w:type="gramEnd"/>
+      <w:r>
+        <w:t>.</w:t>
+      </w:r>
+    </w:p>
+    <w:p>
+      <w:r>
+        <w:rPr>
+          <w:noProof/>
+        </w:rPr>
+        <w:drawing>
+          <wp:inline distT="0" distB="0" distL="0" distR="0" wp14:anchorId="55F8A2BE" wp14:editId="63E8D341">
+            <wp:extent cx="6689018" cy="2581275"/>
+            <wp:effectExtent l="0" t="0" r="0" b="0"/>
+            <wp:docPr id="520859033" name="Picture 1"/>
+            <wp:cNvGraphicFramePr>
+              <a:graphicFrameLocks xmlns:a="http://schemas.openxmlformats.org/drawingml/2006/main" noChangeAspect="1"/>
+            </wp:cNvGraphicFramePr>
+            <a:graphic xmlns:a="http://schemas.openxmlformats.org/drawingml/2006/main">
+              <a:graphicData uri="http://schemas.openxmlformats.org/drawingml/2006/picture">
+                <pic:pic xmlns:pic="http://schemas.openxmlformats.org/drawingml/2006/picture">
+                  <pic:nvPicPr>
+                    <pic:cNvPr id="520859033" name=""/>
+                    <pic:cNvPicPr/>
+                  </pic:nvPicPr>
+                  <pic:blipFill>
+                    <a:blip r:embed="rId11"/>
+                    <a:stretch>
+                      <a:fillRect/>
+                    </a:stretch>
+                  </pic:blipFill>
+                  <pic:spPr>
+                    <a:xfrm>
+                      <a:off x="0" y="0"/>
+                      <a:ext cx="6697939" cy="2584717"/>
+                    </a:xfrm>
+                    <a:prstGeom prst="rect">
+                      <a:avLst/>
+                    </a:prstGeom>
+                  </pic:spPr>
+                </pic:pic>
+              </a:graphicData>
+            </a:graphic>
+          </wp:inline>
+        </w:drawing>
+      </w:r>
+    </w:p>
+    <w:p>
+      <w:pPr>
+        <w:ind w:left="720" w:firstLine="720"/>
+      </w:pPr>
+      <w:r>
+        <w:t>=====================================================</w:t>
+      </w:r>
+    </w:p>
+    <w:p>
+      <w:r>
+        <w:rPr>
+          <w:noProof/>
+        </w:rPr>
+        <w:lastRenderedPageBreak/>
+        <w:drawing>
+          <wp:inline distT="0" distB="0" distL="0" distR="0" wp14:anchorId="1E04C775" wp14:editId="45AFCA80">
+            <wp:extent cx="6588125" cy="2533650"/>
+            <wp:effectExtent l="0" t="0" r="3175" b="0"/>
+            <wp:docPr id="1513094386" name="Picture 1"/>
+            <wp:cNvGraphicFramePr>
+              <a:graphicFrameLocks xmlns:a="http://schemas.openxmlformats.org/drawingml/2006/main" noChangeAspect="1"/>
+            </wp:cNvGraphicFramePr>
+            <a:graphic xmlns:a="http://schemas.openxmlformats.org/drawingml/2006/main">
+              <a:graphicData uri="http://schemas.openxmlformats.org/drawingml/2006/picture">
+                <pic:pic xmlns:pic="http://schemas.openxmlformats.org/drawingml/2006/picture">
+                  <pic:nvPicPr>
+                    <pic:cNvPr id="1513094386" name=""/>
+                    <pic:cNvPicPr/>
+                  </pic:nvPicPr>
+                  <pic:blipFill>
+                    <a:blip r:embed="rId12"/>
+                    <a:stretch>
+                      <a:fillRect/>
+                    </a:stretch>
+                  </pic:blipFill>
+                  <pic:spPr>
+                    <a:xfrm>
+                      <a:off x="0" y="0"/>
+                      <a:ext cx="6591677" cy="2535016"/>
+                    </a:xfrm>
+                    <a:prstGeom prst="rect">
+                      <a:avLst/>
+                    </a:prstGeom>
+                  </pic:spPr>
+                </pic:pic>
+              </a:graphicData>
+            </a:graphic>
+          </wp:inline>
+        </w:drawing>
+      </w:r>
+    </w:p>
+    <w:p>
+      <w:pPr>
+        <w:ind w:left="720" w:firstLine="720"/>
+      </w:pPr>
+      <w:r>
+        <w:rPr>
+          <w:noProof/>
+        </w:rPr>
+        <w:drawing>
+          <wp:anchor distT="0" distB="0" distL="114300" distR="114300" simplePos="0" relativeHeight="251659264" behindDoc="0" locked="0" layoutInCell="1" allowOverlap="1" wp14:anchorId="7FA815DA" wp14:editId="22E2CAD4">
+            <wp:simplePos x="0" y="0"/>
+            <wp:positionH relativeFrom="margin">
+              <wp:posOffset>3171825</wp:posOffset>
+            </wp:positionH>
+            <wp:positionV relativeFrom="page">
+              <wp:posOffset>3857625</wp:posOffset>
+            </wp:positionV>
+            <wp:extent cx="2768600" cy="3467100"/>
+            <wp:effectExtent l="0" t="0" r="0" b="0"/>
+            <wp:wrapSquare wrapText="bothSides"/>
+            <wp:docPr id="885190155" name="Picture 1"/>
+            <wp:cNvGraphicFramePr>
+              <a:graphicFrameLocks xmlns:a="http://schemas.openxmlformats.org/drawingml/2006/main" noChangeAspect="1"/>
+            </wp:cNvGraphicFramePr>
+            <a:graphic xmlns:a="http://schemas.openxmlformats.org/drawingml/2006/main">
+              <a:graphicData uri="http://schemas.openxmlformats.org/drawingml/2006/picture">
+                <pic:pic xmlns:pic="http://schemas.openxmlformats.org/drawingml/2006/picture">
+                  <pic:nvPicPr>
+                    <pic:cNvPr id="885190155" name=""/>
+                    <pic:cNvPicPr/>
+                  </pic:nvPicPr>
+                  <pic:blipFill>
+                    <a:blip r:embed="rId13">
+                      <a:extLst>
+                        <a:ext uri="{28A0092B-C50C-407E-A947-70E740481C1C}">
+                          <a14:useLocalDpi xmlns:a14="http://schemas.microsoft.com/office/drawing/2010/main" val="0"/>
+                        </a:ext>
+                      </a:extLst>
+                    </a:blip>
+                    <a:stretch>
+                      <a:fillRect/>
+                    </a:stretch>
+                  </pic:blipFill>
+                  <pic:spPr>
+                    <a:xfrm>
+                      <a:off x="0" y="0"/>
+                      <a:ext cx="2768600" cy="3467100"/>
+                    </a:xfrm>
+                    <a:prstGeom prst="rect">
+                      <a:avLst/>
+                    </a:prstGeom>
+                  </pic:spPr>
+                </pic:pic>
+              </a:graphicData>
+            </a:graphic>
+          </wp:anchor>
+        </w:drawing>
+      </w:r>
+      <w:r>
+        <w:t>=====================================================</w:t>
+      </w:r>
+    </w:p>
+    <w:p>
+      <w:pPr>
+        <w:ind w:left="720" w:firstLine="720"/>
+      </w:pPr>
+      <w:r>
+        <w:t>=====================================================</w:t>
+      </w:r>
+    </w:p>
+    <w:p>
+      <w:r>
+        <w:rPr>
+          <w:noProof/>
+        </w:rPr>
+        <w:drawing>
+          <wp:anchor distT="0" distB="0" distL="114300" distR="114300" simplePos="0" relativeHeight="251660288" behindDoc="0" locked="0" layoutInCell="1" allowOverlap="1" wp14:anchorId="3857EA01" wp14:editId="0B2B1C8B">
+            <wp:simplePos x="0" y="0"/>
+            <wp:positionH relativeFrom="column">
+              <wp:posOffset>0</wp:posOffset>
+            </wp:positionH>
+            <wp:positionV relativeFrom="page">
+              <wp:posOffset>3895725</wp:posOffset>
+            </wp:positionV>
+            <wp:extent cx="2771775" cy="3446780"/>
+            <wp:effectExtent l="0" t="0" r="9525" b="1270"/>
+            <wp:wrapSquare wrapText="bothSides"/>
+            <wp:docPr id="497132021" name="Picture 1"/>
+            <wp:cNvGraphicFramePr>
+              <a:graphicFrameLocks xmlns:a="http://schemas.openxmlformats.org/drawingml/2006/main" noChangeAspect="1"/>
+            </wp:cNvGraphicFramePr>
+            <a:graphic xmlns:a="http://schemas.openxmlformats.org/drawingml/2006/main">
+              <a:graphicData uri="http://schemas.openxmlformats.org/drawingml/2006/picture">
+                <pic:pic xmlns:pic="http://schemas.openxmlformats.org/drawingml/2006/picture">
+                  <pic:nvPicPr>
+                    <pic:cNvPr id="497132021" name=""/>
+                    <pic:cNvPicPr/>
+                  </pic:nvPicPr>
+                  <pic:blipFill>
+                    <a:blip r:embed="rId14">
+                      <a:extLst>
+                        <a:ext uri="{28A0092B-C50C-407E-A947-70E740481C1C}">
+                          <a14:useLocalDpi xmlns:a14="http://schemas.microsoft.com/office/drawing/2010/main" val="0"/>
+                        </a:ext>
+                      </a:extLst>
+                    </a:blip>
+                    <a:stretch>
+                      <a:fillRect/>
+                    </a:stretch>
+                  </pic:blipFill>
+                  <pic:spPr>
+                    <a:xfrm>
+                      <a:off x="0" y="0"/>
+                      <a:ext cx="2771775" cy="3446780"/>
+                    </a:xfrm>
+                    <a:prstGeom prst="rect">
+                      <a:avLst/>
+                    </a:prstGeom>
+                  </pic:spPr>
+                </pic:pic>
+              </a:graphicData>
+            </a:graphic>
+          </wp:anchor>
+        </w:drawing>
+      </w:r>
+    </w:p>
+    <w:p/>
+    <w:p/>
+    <w:p/>
+    <w:p/>
+    <w:p/>
+    <w:p/>
+    <w:p/>
+    <w:p/>
+    <w:p/>
+    <w:p/>
     <w:p/>
     <w:sectPr>
       <w:pgSz w:w="12240" w:h="15840"/>
@@ -709,7 +1334,6 @@
   <w:style w:type="character" w:default="1" w:styleId="DefaultParagraphFont">
     <w:name w:val="Default Paragraph Font"/>
     <w:uiPriority w:val="1"/>
-    <w:semiHidden/>
     <w:unhideWhenUsed/>
   </w:style>
   <w:style w:type="table" w:default="1" w:styleId="TableNormal">

</xml_diff>